<commit_message>
Knowledge - 3-Work knowledge - 1/24/2026 - part 1
</commit_message>
<xml_diff>
--- a/Knowledge/3-Work knowledge/1-Software Engineering/1-Software Engineering Fundamentals/5-My Source/1-Network Traffic/1-Types of Network Traffic/10-North-South Network Traffic.docx
+++ b/Knowledge/3-Work knowledge/1-Software Engineering/1-Software Engineering Fundamentals/5-My Source/1-Network Traffic/1-Types of Network Traffic/10-North-South Network Traffic.docx
@@ -4,72 +4,39 @@
   <w:body>
     <w:p>
       <w:pPr>
-        <w:keepNext/>
-        <w:keepLines/>
-        <w:spacing w:before="360" w:after="80" w:line="276" w:lineRule="auto"/>
-        <w:outlineLvl w:val="0"/>
-        <w:rPr>
-          <w:rFonts w:asciiTheme="majorHAnsi" w:eastAsiaTheme="majorEastAsia" w:hAnsiTheme="majorHAnsi" w:cstheme="majorBidi"/>
-          <w:color w:val="2F5496" w:themeColor="accent1" w:themeShade="BF"/>
-          <w:kern w:val="0"/>
-          <w:sz w:val="40"/>
-          <w:szCs w:val="40"/>
-          <w:lang w:val="en"/>
-          <w14:ligatures w14:val="none"/>
+        <w:pStyle w:val="Heading1"/>
+        <w:rPr>
+          <w:lang w:val="en"/>
         </w:rPr>
       </w:pPr>
       <w:bookmarkStart w:id="0" w:name="_o49930n4mf1s" w:colFirst="0" w:colLast="0"/>
       <w:bookmarkEnd w:id="0"/>
       <w:r>
         <w:rPr>
-          <w:rFonts w:asciiTheme="majorHAnsi" w:eastAsiaTheme="majorEastAsia" w:hAnsiTheme="majorHAnsi" w:cstheme="majorBidi"/>
-          <w:color w:val="2F5496" w:themeColor="accent1" w:themeShade="BF"/>
-          <w:kern w:val="0"/>
-          <w:sz w:val="40"/>
-          <w:szCs w:val="40"/>
-          <w:lang w:val="en"/>
-          <w14:ligatures w14:val="none"/>
+          <w:lang w:val="en"/>
         </w:rPr>
         <w:t>North-South Network Traffic</w:t>
       </w:r>
     </w:p>
     <w:p>
       <w:pPr>
-        <w:spacing w:before="280" w:after="80" w:line="276" w:lineRule="auto"/>
-        <w:outlineLvl w:val="1"/>
-        <w:rPr>
-          <w:rFonts w:asciiTheme="majorHAnsi" w:eastAsiaTheme="majorEastAsia" w:hAnsiTheme="majorHAnsi" w:cstheme="majorBidi"/>
-          <w:color w:val="2F5496" w:themeColor="accent1" w:themeShade="BF"/>
-          <w:kern w:val="0"/>
-          <w:sz w:val="32"/>
-          <w:szCs w:val="32"/>
-          <w:lang w:val="en"/>
-          <w14:ligatures w14:val="none"/>
+        <w:pStyle w:val="Heading2"/>
+        <w:rPr>
+          <w:lang w:val="en"/>
         </w:rPr>
       </w:pPr>
       <w:bookmarkStart w:id="1" w:name="_bn0z2j38ncle" w:colFirst="0" w:colLast="0"/>
       <w:bookmarkEnd w:id="1"/>
       <w:r>
         <w:rPr>
-          <w:rFonts w:ascii="Segoe UI Emoji" w:eastAsiaTheme="majorEastAsia" w:hAnsi="Segoe UI Emoji" w:cs="Segoe UI Emoji"/>
-          <w:color w:val="2F5496" w:themeColor="accent1" w:themeShade="BF"/>
-          <w:kern w:val="0"/>
-          <w:sz w:val="32"/>
-          <w:szCs w:val="32"/>
-          <w:lang w:val="en"/>
-          <w14:ligatures w14:val="none"/>
+          <w:rFonts w:ascii="Segoe UI Emoji" w:hAnsi="Segoe UI Emoji" w:cs="Segoe UI Emoji"/>
+          <w:lang w:val="en"/>
         </w:rPr>
         <w:t>🧭</w:t>
       </w:r>
       <w:r>
         <w:rPr>
-          <w:rFonts w:asciiTheme="majorHAnsi" w:eastAsiaTheme="majorEastAsia" w:hAnsiTheme="majorHAnsi" w:cstheme="majorBidi"/>
-          <w:color w:val="2F5496" w:themeColor="accent1" w:themeShade="BF"/>
-          <w:kern w:val="0"/>
-          <w:sz w:val="32"/>
-          <w:szCs w:val="32"/>
-          <w:lang w:val="en"/>
-          <w14:ligatures w14:val="none"/>
+          <w:lang w:val="en"/>
         </w:rPr>
         <w:t xml:space="preserve"> What Is North-South Network Traffic?</w:t>
       </w:r>
@@ -277,41 +244,23 @@
     </w:p>
     <w:p>
       <w:pPr>
-        <w:spacing w:before="280" w:after="80" w:line="276" w:lineRule="auto"/>
-        <w:outlineLvl w:val="1"/>
-        <w:rPr>
-          <w:rFonts w:asciiTheme="majorHAnsi" w:eastAsiaTheme="majorEastAsia" w:hAnsiTheme="majorHAnsi" w:cstheme="majorBidi"/>
-          <w:color w:val="2F5496" w:themeColor="accent1" w:themeShade="BF"/>
-          <w:kern w:val="0"/>
-          <w:sz w:val="32"/>
-          <w:szCs w:val="32"/>
-          <w:lang w:val="en"/>
-          <w14:ligatures w14:val="none"/>
+        <w:pStyle w:val="Heading2"/>
+        <w:rPr>
+          <w:lang w:val="en"/>
         </w:rPr>
       </w:pPr>
       <w:bookmarkStart w:id="2" w:name="_f3l84glph642" w:colFirst="0" w:colLast="0"/>
       <w:bookmarkEnd w:id="2"/>
       <w:r>
         <w:rPr>
-          <w:rFonts w:ascii="Segoe UI Emoji" w:eastAsiaTheme="majorEastAsia" w:hAnsi="Segoe UI Emoji" w:cs="Segoe UI Emoji"/>
-          <w:color w:val="2F5496" w:themeColor="accent1" w:themeShade="BF"/>
-          <w:kern w:val="0"/>
-          <w:sz w:val="32"/>
-          <w:szCs w:val="32"/>
-          <w:lang w:val="en"/>
-          <w14:ligatures w14:val="none"/>
+          <w:rFonts w:ascii="Segoe UI Emoji" w:hAnsi="Segoe UI Emoji" w:cs="Segoe UI Emoji"/>
+          <w:lang w:val="en"/>
         </w:rPr>
         <w:t>🧠</w:t>
       </w:r>
       <w:r>
         <w:rPr>
-          <w:rFonts w:asciiTheme="majorHAnsi" w:eastAsiaTheme="majorEastAsia" w:hAnsiTheme="majorHAnsi" w:cstheme="majorBidi"/>
-          <w:color w:val="2F5496" w:themeColor="accent1" w:themeShade="BF"/>
-          <w:kern w:val="0"/>
-          <w:sz w:val="32"/>
-          <w:szCs w:val="32"/>
-          <w:lang w:val="en"/>
-          <w14:ligatures w14:val="none"/>
+          <w:lang w:val="en"/>
         </w:rPr>
         <w:t xml:space="preserve"> Simple Definition:</w:t>
       </w:r>
@@ -544,41 +493,23 @@
     </w:p>
     <w:p>
       <w:pPr>
-        <w:spacing w:before="280" w:after="80" w:line="276" w:lineRule="auto"/>
-        <w:outlineLvl w:val="1"/>
-        <w:rPr>
-          <w:rFonts w:asciiTheme="majorHAnsi" w:eastAsiaTheme="majorEastAsia" w:hAnsiTheme="majorHAnsi" w:cstheme="majorBidi"/>
-          <w:color w:val="2F5496" w:themeColor="accent1" w:themeShade="BF"/>
-          <w:kern w:val="0"/>
-          <w:sz w:val="32"/>
-          <w:szCs w:val="32"/>
-          <w:lang w:val="en"/>
-          <w14:ligatures w14:val="none"/>
+        <w:pStyle w:val="Heading2"/>
+        <w:rPr>
+          <w:lang w:val="en"/>
         </w:rPr>
       </w:pPr>
       <w:bookmarkStart w:id="3" w:name="_ttya9b3jjseg" w:colFirst="0" w:colLast="0"/>
       <w:bookmarkEnd w:id="3"/>
       <w:r>
         <w:rPr>
-          <w:rFonts w:ascii="Segoe UI Emoji" w:eastAsiaTheme="majorEastAsia" w:hAnsi="Segoe UI Emoji" w:cs="Segoe UI Emoji"/>
-          <w:color w:val="2F5496" w:themeColor="accent1" w:themeShade="BF"/>
-          <w:kern w:val="0"/>
-          <w:sz w:val="32"/>
-          <w:szCs w:val="32"/>
-          <w:lang w:val="en"/>
-          <w14:ligatures w14:val="none"/>
+          <w:rFonts w:ascii="Segoe UI Emoji" w:hAnsi="Segoe UI Emoji" w:cs="Segoe UI Emoji"/>
+          <w:lang w:val="en"/>
         </w:rPr>
         <w:t>📡</w:t>
       </w:r>
       <w:r>
         <w:rPr>
-          <w:rFonts w:asciiTheme="majorHAnsi" w:eastAsiaTheme="majorEastAsia" w:hAnsiTheme="majorHAnsi" w:cstheme="majorBidi"/>
-          <w:color w:val="2F5496" w:themeColor="accent1" w:themeShade="BF"/>
-          <w:kern w:val="0"/>
-          <w:sz w:val="32"/>
-          <w:szCs w:val="32"/>
-          <w:lang w:val="en"/>
-          <w14:ligatures w14:val="none"/>
+          <w:lang w:val="en"/>
         </w:rPr>
         <w:t xml:space="preserve"> Examples of North-South Traffic</w:t>
       </w:r>
@@ -1106,6 +1037,7 @@
                 <w:lang w:val="en"/>
                 <w14:ligatures w14:val="none"/>
               </w:rPr>
+              <w:lastRenderedPageBreak/>
               <w:t>📤</w:t>
             </w:r>
             <w:r>
@@ -1316,41 +1248,23 @@
     </w:p>
     <w:p>
       <w:pPr>
-        <w:spacing w:before="280" w:after="80" w:line="276" w:lineRule="auto"/>
-        <w:outlineLvl w:val="1"/>
-        <w:rPr>
-          <w:rFonts w:asciiTheme="majorHAnsi" w:eastAsiaTheme="majorEastAsia" w:hAnsiTheme="majorHAnsi" w:cstheme="majorBidi"/>
-          <w:color w:val="2F5496" w:themeColor="accent1" w:themeShade="BF"/>
-          <w:kern w:val="0"/>
-          <w:sz w:val="32"/>
-          <w:szCs w:val="32"/>
-          <w:lang w:val="en"/>
-          <w14:ligatures w14:val="none"/>
+        <w:pStyle w:val="Heading2"/>
+        <w:rPr>
+          <w:lang w:val="en"/>
         </w:rPr>
       </w:pPr>
       <w:bookmarkStart w:id="4" w:name="_mzgcv746rrla" w:colFirst="0" w:colLast="0"/>
       <w:bookmarkEnd w:id="4"/>
       <w:r>
         <w:rPr>
-          <w:rFonts w:ascii="Segoe UI Emoji" w:eastAsiaTheme="majorEastAsia" w:hAnsi="Segoe UI Emoji" w:cs="Segoe UI Emoji"/>
-          <w:color w:val="2F5496" w:themeColor="accent1" w:themeShade="BF"/>
-          <w:kern w:val="0"/>
-          <w:sz w:val="32"/>
-          <w:szCs w:val="32"/>
-          <w:lang w:val="en"/>
-          <w14:ligatures w14:val="none"/>
+          <w:rFonts w:ascii="Segoe UI Emoji" w:hAnsi="Segoe UI Emoji" w:cs="Segoe UI Emoji"/>
+          <w:lang w:val="en"/>
         </w:rPr>
         <w:t>🧭</w:t>
       </w:r>
       <w:r>
         <w:rPr>
-          <w:rFonts w:asciiTheme="majorHAnsi" w:eastAsiaTheme="majorEastAsia" w:hAnsiTheme="majorHAnsi" w:cstheme="majorBidi"/>
-          <w:color w:val="2F5496" w:themeColor="accent1" w:themeShade="BF"/>
-          <w:kern w:val="0"/>
-          <w:sz w:val="32"/>
-          <w:szCs w:val="32"/>
-          <w:lang w:val="en"/>
-          <w14:ligatures w14:val="none"/>
+          <w:lang w:val="en"/>
         </w:rPr>
         <w:t xml:space="preserve"> Why “North-South”?</w:t>
       </w:r>
@@ -1674,41 +1588,23 @@
     </w:p>
     <w:p>
       <w:pPr>
-        <w:spacing w:before="280" w:after="80" w:line="276" w:lineRule="auto"/>
-        <w:outlineLvl w:val="1"/>
-        <w:rPr>
-          <w:rFonts w:asciiTheme="majorHAnsi" w:eastAsiaTheme="majorEastAsia" w:hAnsiTheme="majorHAnsi" w:cstheme="majorBidi"/>
-          <w:color w:val="2F5496" w:themeColor="accent1" w:themeShade="BF"/>
-          <w:kern w:val="0"/>
-          <w:sz w:val="32"/>
-          <w:szCs w:val="32"/>
-          <w:lang w:val="en"/>
-          <w14:ligatures w14:val="none"/>
+        <w:pStyle w:val="Heading2"/>
+        <w:rPr>
+          <w:lang w:val="en"/>
         </w:rPr>
       </w:pPr>
       <w:bookmarkStart w:id="5" w:name="_sbyltwcjl106" w:colFirst="0" w:colLast="0"/>
       <w:bookmarkEnd w:id="5"/>
       <w:r>
         <w:rPr>
-          <w:rFonts w:ascii="Segoe UI Emoji" w:eastAsiaTheme="majorEastAsia" w:hAnsi="Segoe UI Emoji" w:cs="Segoe UI Emoji"/>
-          <w:color w:val="2F5496" w:themeColor="accent1" w:themeShade="BF"/>
-          <w:kern w:val="0"/>
-          <w:sz w:val="32"/>
-          <w:szCs w:val="32"/>
-          <w:lang w:val="en"/>
-          <w14:ligatures w14:val="none"/>
+          <w:rFonts w:ascii="Segoe UI Emoji" w:hAnsi="Segoe UI Emoji" w:cs="Segoe UI Emoji"/>
+          <w:lang w:val="en"/>
         </w:rPr>
         <w:t>📦</w:t>
       </w:r>
       <w:r>
         <w:rPr>
-          <w:rFonts w:asciiTheme="majorHAnsi" w:eastAsiaTheme="majorEastAsia" w:hAnsiTheme="majorHAnsi" w:cstheme="majorBidi"/>
-          <w:color w:val="2F5496" w:themeColor="accent1" w:themeShade="BF"/>
-          <w:kern w:val="0"/>
-          <w:sz w:val="32"/>
-          <w:szCs w:val="32"/>
-          <w:lang w:val="en"/>
-          <w14:ligatures w14:val="none"/>
+          <w:lang w:val="en"/>
         </w:rPr>
         <w:t xml:space="preserve"> Characteristics of North-South Traffic</w:t>
       </w:r>
@@ -2236,6 +2132,7 @@
                 <w:lang w:val="en"/>
                 <w14:ligatures w14:val="none"/>
               </w:rPr>
+              <w:lastRenderedPageBreak/>
               <w:t>📉</w:t>
             </w:r>
             <w:r>
@@ -2446,41 +2343,23 @@
     </w:p>
     <w:p>
       <w:pPr>
-        <w:spacing w:before="280" w:after="80" w:line="276" w:lineRule="auto"/>
-        <w:outlineLvl w:val="1"/>
-        <w:rPr>
-          <w:rFonts w:asciiTheme="majorHAnsi" w:eastAsiaTheme="majorEastAsia" w:hAnsiTheme="majorHAnsi" w:cstheme="majorBidi"/>
-          <w:color w:val="2F5496" w:themeColor="accent1" w:themeShade="BF"/>
-          <w:kern w:val="0"/>
-          <w:sz w:val="32"/>
-          <w:szCs w:val="32"/>
-          <w:lang w:val="en"/>
-          <w14:ligatures w14:val="none"/>
+        <w:pStyle w:val="Heading2"/>
+        <w:rPr>
+          <w:lang w:val="en"/>
         </w:rPr>
       </w:pPr>
       <w:bookmarkStart w:id="6" w:name="_fu3lik7a2nyv" w:colFirst="0" w:colLast="0"/>
       <w:bookmarkEnd w:id="6"/>
       <w:r>
         <w:rPr>
-          <w:rFonts w:ascii="Segoe UI Emoji" w:eastAsiaTheme="majorEastAsia" w:hAnsi="Segoe UI Emoji" w:cs="Segoe UI Emoji"/>
-          <w:color w:val="2F5496" w:themeColor="accent1" w:themeShade="BF"/>
-          <w:kern w:val="0"/>
-          <w:sz w:val="32"/>
-          <w:szCs w:val="32"/>
-          <w:lang w:val="en"/>
-          <w14:ligatures w14:val="none"/>
+          <w:rFonts w:ascii="Segoe UI Emoji" w:hAnsi="Segoe UI Emoji" w:cs="Segoe UI Emoji"/>
+          <w:lang w:val="en"/>
         </w:rPr>
         <w:t>🔐</w:t>
       </w:r>
       <w:r>
         <w:rPr>
-          <w:rFonts w:asciiTheme="majorHAnsi" w:eastAsiaTheme="majorEastAsia" w:hAnsiTheme="majorHAnsi" w:cstheme="majorBidi"/>
-          <w:color w:val="2F5496" w:themeColor="accent1" w:themeShade="BF"/>
-          <w:kern w:val="0"/>
-          <w:sz w:val="32"/>
-          <w:szCs w:val="32"/>
-          <w:lang w:val="en"/>
-          <w14:ligatures w14:val="none"/>
+          <w:lang w:val="en"/>
         </w:rPr>
         <w:t xml:space="preserve"> Security Considerations</w:t>
       </w:r>
@@ -3218,41 +3097,23 @@
     </w:p>
     <w:p>
       <w:pPr>
-        <w:spacing w:before="280" w:after="80" w:line="276" w:lineRule="auto"/>
-        <w:outlineLvl w:val="1"/>
-        <w:rPr>
-          <w:rFonts w:asciiTheme="majorHAnsi" w:eastAsiaTheme="majorEastAsia" w:hAnsiTheme="majorHAnsi" w:cstheme="majorBidi"/>
-          <w:color w:val="2F5496" w:themeColor="accent1" w:themeShade="BF"/>
-          <w:kern w:val="0"/>
-          <w:sz w:val="32"/>
-          <w:szCs w:val="32"/>
-          <w:lang w:val="en"/>
-          <w14:ligatures w14:val="none"/>
+        <w:pStyle w:val="Heading2"/>
+        <w:rPr>
+          <w:lang w:val="en"/>
         </w:rPr>
       </w:pPr>
       <w:bookmarkStart w:id="7" w:name="_scv7b6r3kf04" w:colFirst="0" w:colLast="0"/>
       <w:bookmarkEnd w:id="7"/>
       <w:r>
         <w:rPr>
-          <w:rFonts w:ascii="Segoe UI Emoji" w:eastAsiaTheme="majorEastAsia" w:hAnsi="Segoe UI Emoji" w:cs="Segoe UI Emoji"/>
-          <w:color w:val="2F5496" w:themeColor="accent1" w:themeShade="BF"/>
-          <w:kern w:val="0"/>
-          <w:sz w:val="32"/>
-          <w:szCs w:val="32"/>
-          <w:lang w:val="en"/>
-          <w14:ligatures w14:val="none"/>
+          <w:rFonts w:ascii="Segoe UI Emoji" w:hAnsi="Segoe UI Emoji" w:cs="Segoe UI Emoji"/>
+          <w:lang w:val="en"/>
         </w:rPr>
         <w:t>🆚</w:t>
       </w:r>
       <w:r>
         <w:rPr>
-          <w:rFonts w:asciiTheme="majorHAnsi" w:eastAsiaTheme="majorEastAsia" w:hAnsiTheme="majorHAnsi" w:cstheme="majorBidi"/>
-          <w:color w:val="2F5496" w:themeColor="accent1" w:themeShade="BF"/>
-          <w:kern w:val="0"/>
-          <w:sz w:val="32"/>
-          <w:szCs w:val="32"/>
-          <w:lang w:val="en"/>
-          <w14:ligatures w14:val="none"/>
+          <w:lang w:val="en"/>
         </w:rPr>
         <w:t xml:space="preserve"> North-South vs East-West Traffic</w:t>
       </w:r>
@@ -3369,6 +3230,7 @@
           <w:lang w:val="en"/>
           <w14:ligatures w14:val="none"/>
         </w:rPr>
+        <w:lastRenderedPageBreak/>
         <w:drawing>
           <wp:inline distT="114300" distB="114300" distL="114300" distR="114300" wp14:anchorId="68B8B8F9" wp14:editId="119D07A8">
             <wp:extent cx="5943600" cy="1993900"/>
@@ -4330,41 +4192,23 @@
     </w:p>
     <w:p>
       <w:pPr>
-        <w:spacing w:before="280" w:after="80" w:line="276" w:lineRule="auto"/>
-        <w:outlineLvl w:val="1"/>
-        <w:rPr>
-          <w:rFonts w:asciiTheme="majorHAnsi" w:eastAsiaTheme="majorEastAsia" w:hAnsiTheme="majorHAnsi" w:cstheme="majorBidi"/>
-          <w:color w:val="2F5496" w:themeColor="accent1" w:themeShade="BF"/>
-          <w:kern w:val="0"/>
-          <w:sz w:val="32"/>
-          <w:szCs w:val="32"/>
-          <w:lang w:val="en"/>
-          <w14:ligatures w14:val="none"/>
+        <w:pStyle w:val="Heading2"/>
+        <w:rPr>
+          <w:lang w:val="en"/>
         </w:rPr>
       </w:pPr>
       <w:bookmarkStart w:id="8" w:name="_nwo5bfrqsr5b" w:colFirst="0" w:colLast="0"/>
       <w:bookmarkEnd w:id="8"/>
       <w:r>
         <w:rPr>
-          <w:rFonts w:ascii="Segoe UI Emoji" w:eastAsiaTheme="majorEastAsia" w:hAnsi="Segoe UI Emoji" w:cs="Segoe UI Emoji"/>
-          <w:color w:val="2F5496" w:themeColor="accent1" w:themeShade="BF"/>
-          <w:kern w:val="0"/>
-          <w:sz w:val="32"/>
-          <w:szCs w:val="32"/>
-          <w:lang w:val="en"/>
-          <w14:ligatures w14:val="none"/>
+          <w:rFonts w:ascii="Segoe UI Emoji" w:hAnsi="Segoe UI Emoji" w:cs="Segoe UI Emoji"/>
+          <w:lang w:val="en"/>
         </w:rPr>
         <w:t>📌</w:t>
       </w:r>
       <w:r>
         <w:rPr>
-          <w:rFonts w:asciiTheme="majorHAnsi" w:eastAsiaTheme="majorEastAsia" w:hAnsiTheme="majorHAnsi" w:cstheme="majorBidi"/>
-          <w:color w:val="2F5496" w:themeColor="accent1" w:themeShade="BF"/>
-          <w:kern w:val="0"/>
-          <w:sz w:val="32"/>
-          <w:szCs w:val="32"/>
-          <w:lang w:val="en"/>
-          <w14:ligatures w14:val="none"/>
+          <w:lang w:val="en"/>
         </w:rPr>
         <w:t xml:space="preserve"> Summary</w:t>
       </w:r>
@@ -4580,6 +4424,7 @@
                 <w:lang w:val="en"/>
                 <w14:ligatures w14:val="none"/>
               </w:rPr>
+              <w:lastRenderedPageBreak/>
               <w:t>Attribute</w:t>
             </w:r>
           </w:p>
@@ -5722,7 +5567,6 @@
     <w:next w:val="Normal"/>
     <w:link w:val="Heading2Char"/>
     <w:uiPriority w:val="9"/>
-    <w:semiHidden/>
     <w:unhideWhenUsed/>
     <w:qFormat/>
     <w:rsid w:val="003D3674"/>
@@ -5939,7 +5783,6 @@
     <w:basedOn w:val="DefaultParagraphFont"/>
     <w:link w:val="Heading2"/>
     <w:uiPriority w:val="9"/>
-    <w:semiHidden/>
     <w:rsid w:val="003D3674"/>
     <w:rPr>
       <w:rFonts w:asciiTheme="majorHAnsi" w:eastAsiaTheme="majorEastAsia" w:hAnsiTheme="majorHAnsi" w:cstheme="majorBidi"/>

</xml_diff>